<commit_message>
Update document reminders and procurement template
</commit_message>
<xml_diff>
--- a/Template/Procurement/3.TOR/3.1.3 TORธุรการ9000-สอน.docx
+++ b/Template/Procurement/3.TOR/3.1.3 TORธุรการ9000-สอน.docx
@@ -696,8 +696,19 @@
           <w:szCs w:val="32"/>
           <w:cs/>
         </w:rPr>
-        <w:t xml:space="preserve"> มีคุณวุฒิไม่ต่ำกว่าระดับประกาศนียบัตรวิชาชีพ (ปวช</w:t>
-      </w:r>
+        <w:t xml:space="preserve"> มีคุณวุฒิไม่ต่ำกว่าระดับประกาศนียบัตรวิชาชีพ (</w:t>
+      </w:r>
+      <w:proofErr w:type="spellStart"/>
+      <w:r>
+        <w:rPr>
+          <w:rFonts w:ascii="TH SarabunIT๙" w:hAnsi="TH SarabunIT๙" w:cs="TH SarabunIT๙" w:hint="cs"/>
+          <w:sz w:val="32"/>
+          <w:szCs w:val="32"/>
+          <w:cs/>
+        </w:rPr>
+        <w:t>ปวช</w:t>
+      </w:r>
+      <w:proofErr w:type="spellEnd"/>
       <w:r>
         <w:rPr>
           <w:rFonts w:ascii="TH SarabunIT๙" w:hAnsi="TH SarabunIT๙" w:cs="TH SarabunIT๙"/>
@@ -3695,9 +3706,10 @@
         <w:ind w:left="1434" w:firstLine="6"/>
         <w:contextualSpacing w:val="0"/>
         <w:rPr>
-          <w:rFonts w:ascii="TH SarabunIT๙" w:hAnsi="TH SarabunIT๙" w:cs="TH SarabunIT๙"/>
-          <w:sz w:val="32"/>
-          <w:szCs w:val="32"/>
+          <w:rFonts w:ascii="TH SarabunIT๙" w:hAnsi="TH SarabunIT๙" w:cs="TH SarabunIT๙" w:hint="cs"/>
+          <w:sz w:val="32"/>
+          <w:szCs w:val="32"/>
+          <w:cs/>
         </w:rPr>
       </w:pPr>
       <w:r>
@@ -3840,19 +3852,6 @@
         </w:rPr>
         <w:t>บาท</w:t>
       </w:r>
-    </w:p>
-    <w:p>
-      <w:pPr>
-        <w:pStyle w:val="a9"/>
-        <w:spacing w:after="0" w:line="240" w:lineRule="auto"/>
-        <w:ind w:left="1434" w:firstLine="6"/>
-        <w:contextualSpacing w:val="0"/>
-        <w:rPr>
-          <w:rFonts w:ascii="TH SarabunIT๙" w:hAnsi="TH SarabunIT๙" w:cs="TH SarabunIT๙"/>
-          <w:sz w:val="32"/>
-          <w:szCs w:val="32"/>
-        </w:rPr>
-      </w:pPr>
     </w:p>
     <w:p>
       <w:pPr>
@@ -5409,7 +5408,6 @@
           <w:szCs w:val="32"/>
           <w:cs/>
         </w:rPr>
-        <w:lastRenderedPageBreak/>
         <w:t xml:space="preserve">ในการจัดจ้างโดยวิธีเฉพาะเจาะจงครั้งนี้ </w:t>
       </w:r>
       <w:r>
@@ -5718,8 +5716,19 @@
           <w:szCs w:val="32"/>
           <w:cs/>
         </w:rPr>
-        <w:t>คำนำหน้าสเปค</w:t>
-      </w:r>
+        <w:t>คำนำหน้า</w:t>
+      </w:r>
+      <w:proofErr w:type="spellStart"/>
+      <w:r>
+        <w:rPr>
+          <w:rFonts w:ascii="TH SarabunIT๙" w:eastAsia="Times New Roman" w:hAnsi="TH SarabunIT๙" w:cs="TH SarabunIT๙" w:hint="cs"/>
+          <w:sz w:val="32"/>
+          <w:szCs w:val="32"/>
+          <w:cs/>
+        </w:rPr>
+        <w:t>สเปค</w:t>
+      </w:r>
+      <w:proofErr w:type="spellEnd"/>
       <w:r>
         <w:rPr>
           <w:rFonts w:ascii="TH SarabunIT๙" w:eastAsia="Times New Roman" w:hAnsi="TH SarabunIT๙" w:cs="TH SarabunIT๙"/>
@@ -5735,8 +5744,19 @@
           <w:szCs w:val="32"/>
           <w:cs/>
         </w:rPr>
-        <w:t>ชื่อสเปค</w:t>
-      </w:r>
+        <w:t>ชื่อ</w:t>
+      </w:r>
+      <w:proofErr w:type="spellStart"/>
+      <w:r>
+        <w:rPr>
+          <w:rFonts w:ascii="TH SarabunIT๙" w:eastAsia="Times New Roman" w:hAnsi="TH SarabunIT๙" w:cs="TH SarabunIT๙" w:hint="cs"/>
+          <w:sz w:val="32"/>
+          <w:szCs w:val="32"/>
+          <w:cs/>
+        </w:rPr>
+        <w:t>สเปค</w:t>
+      </w:r>
+      <w:proofErr w:type="spellEnd"/>
       <w:r>
         <w:rPr>
           <w:rFonts w:ascii="TH SarabunIT๙" w:eastAsia="Times New Roman" w:hAnsi="TH SarabunIT๙" w:cs="TH SarabunIT๙"/>
@@ -5769,8 +5789,19 @@
           <w:szCs w:val="32"/>
           <w:cs/>
         </w:rPr>
-        <w:t>นามสกุลสเปค</w:t>
-      </w:r>
+        <w:t>นามสกุล</w:t>
+      </w:r>
+      <w:proofErr w:type="spellStart"/>
+      <w:r>
+        <w:rPr>
+          <w:rFonts w:ascii="TH SarabunIT๙" w:eastAsia="Times New Roman" w:hAnsi="TH SarabunIT๙" w:cs="TH SarabunIT๙" w:hint="cs"/>
+          <w:sz w:val="32"/>
+          <w:szCs w:val="32"/>
+          <w:cs/>
+        </w:rPr>
+        <w:t>สเปค</w:t>
+      </w:r>
+      <w:proofErr w:type="spellEnd"/>
       <w:r>
         <w:rPr>
           <w:rFonts w:ascii="TH SarabunIT๙" w:eastAsia="Times New Roman" w:hAnsi="TH SarabunIT๙" w:cs="TH SarabunIT๙"/>
@@ -5923,8 +5954,19 @@
           <w:szCs w:val="32"/>
           <w:cs/>
         </w:rPr>
-        <w:t>คำนำหน้าสเปค</w:t>
-      </w:r>
+        <w:t>คำนำหน้า</w:t>
+      </w:r>
+      <w:proofErr w:type="spellStart"/>
+      <w:r>
+        <w:rPr>
+          <w:rFonts w:ascii="TH SarabunIT๙" w:eastAsia="Times New Roman" w:hAnsi="TH SarabunIT๙" w:cs="TH SarabunIT๙" w:hint="cs"/>
+          <w:sz w:val="32"/>
+          <w:szCs w:val="32"/>
+          <w:cs/>
+        </w:rPr>
+        <w:t>สเปค</w:t>
+      </w:r>
+      <w:proofErr w:type="spellEnd"/>
       <w:r>
         <w:rPr>
           <w:rFonts w:ascii="TH SarabunIT๙" w:eastAsia="Times New Roman" w:hAnsi="TH SarabunIT๙" w:cs="TH SarabunIT๙"/>
@@ -5940,8 +5982,19 @@
           <w:szCs w:val="32"/>
           <w:cs/>
         </w:rPr>
-        <w:t>ชื่อสเปค</w:t>
-      </w:r>
+        <w:t>ชื่อ</w:t>
+      </w:r>
+      <w:proofErr w:type="spellStart"/>
+      <w:r>
+        <w:rPr>
+          <w:rFonts w:ascii="TH SarabunIT๙" w:eastAsia="Times New Roman" w:hAnsi="TH SarabunIT๙" w:cs="TH SarabunIT๙" w:hint="cs"/>
+          <w:sz w:val="32"/>
+          <w:szCs w:val="32"/>
+          <w:cs/>
+        </w:rPr>
+        <w:t>สเปค</w:t>
+      </w:r>
+      <w:proofErr w:type="spellEnd"/>
       <w:r>
         <w:rPr>
           <w:rFonts w:ascii="TH SarabunIT๙" w:eastAsia="Times New Roman" w:hAnsi="TH SarabunIT๙" w:cs="TH SarabunIT๙"/>
@@ -5974,8 +6027,19 @@
           <w:szCs w:val="32"/>
           <w:cs/>
         </w:rPr>
-        <w:t>นามสกุลสเปค</w:t>
-      </w:r>
+        <w:t>นามสกุล</w:t>
+      </w:r>
+      <w:proofErr w:type="spellStart"/>
+      <w:r>
+        <w:rPr>
+          <w:rFonts w:ascii="TH SarabunIT๙" w:eastAsia="Times New Roman" w:hAnsi="TH SarabunIT๙" w:cs="TH SarabunIT๙" w:hint="cs"/>
+          <w:sz w:val="32"/>
+          <w:szCs w:val="32"/>
+          <w:cs/>
+        </w:rPr>
+        <w:t>สเปค</w:t>
+      </w:r>
+      <w:proofErr w:type="spellEnd"/>
       <w:r>
         <w:rPr>
           <w:rFonts w:ascii="TH SarabunIT๙" w:eastAsia="Times New Roman" w:hAnsi="TH SarabunIT๙" w:cs="TH SarabunIT๙"/>
@@ -6083,8 +6147,19 @@
           <w:szCs w:val="32"/>
           <w:cs/>
         </w:rPr>
-        <w:t>คำนำหน้าสเปค</w:t>
-      </w:r>
+        <w:t>คำนำหน้า</w:t>
+      </w:r>
+      <w:proofErr w:type="spellStart"/>
+      <w:r>
+        <w:rPr>
+          <w:rFonts w:ascii="TH SarabunIT๙" w:eastAsia="Times New Roman" w:hAnsi="TH SarabunIT๙" w:cs="TH SarabunIT๙" w:hint="cs"/>
+          <w:sz w:val="32"/>
+          <w:szCs w:val="32"/>
+          <w:cs/>
+        </w:rPr>
+        <w:t>สเปค</w:t>
+      </w:r>
+      <w:proofErr w:type="spellEnd"/>
       <w:r>
         <w:rPr>
           <w:rFonts w:ascii="TH SarabunIT๙" w:eastAsia="Times New Roman" w:hAnsi="TH SarabunIT๙" w:cs="TH SarabunIT๙"/>
@@ -6100,8 +6175,19 @@
           <w:szCs w:val="32"/>
           <w:cs/>
         </w:rPr>
-        <w:t>ชื่อสเปค</w:t>
-      </w:r>
+        <w:t>ชื่อ</w:t>
+      </w:r>
+      <w:proofErr w:type="spellStart"/>
+      <w:r>
+        <w:rPr>
+          <w:rFonts w:ascii="TH SarabunIT๙" w:eastAsia="Times New Roman" w:hAnsi="TH SarabunIT๙" w:cs="TH SarabunIT๙" w:hint="cs"/>
+          <w:sz w:val="32"/>
+          <w:szCs w:val="32"/>
+          <w:cs/>
+        </w:rPr>
+        <w:t>สเปค</w:t>
+      </w:r>
+      <w:proofErr w:type="spellEnd"/>
       <w:r>
         <w:rPr>
           <w:rFonts w:ascii="TH SarabunIT๙" w:eastAsia="Times New Roman" w:hAnsi="TH SarabunIT๙" w:cs="TH SarabunIT๙"/>
@@ -6134,8 +6220,19 @@
           <w:szCs w:val="32"/>
           <w:cs/>
         </w:rPr>
-        <w:t>นามสกุลสเปค</w:t>
-      </w:r>
+        <w:t>นามสกุล</w:t>
+      </w:r>
+      <w:proofErr w:type="spellStart"/>
+      <w:r>
+        <w:rPr>
+          <w:rFonts w:ascii="TH SarabunIT๙" w:eastAsia="Times New Roman" w:hAnsi="TH SarabunIT๙" w:cs="TH SarabunIT๙" w:hint="cs"/>
+          <w:sz w:val="32"/>
+          <w:szCs w:val="32"/>
+          <w:cs/>
+        </w:rPr>
+        <w:t>สเปค</w:t>
+      </w:r>
+      <w:proofErr w:type="spellEnd"/>
       <w:r>
         <w:rPr>
           <w:rFonts w:ascii="TH SarabunIT๙" w:eastAsia="Times New Roman" w:hAnsi="TH SarabunIT๙" w:cs="TH SarabunIT๙"/>

</xml_diff>